<commit_message>
Add GitHub repository link to validation report
</commit_message>
<xml_diff>
--- a/test-report/ValidationReport.docx
+++ b/test-report/ValidationReport.docx
@@ -420,8 +420,6 @@
                 <w:szCs w:val="22"/>
               </w:rPr>
             </w:pPr>
-            <w:proofErr w:type="spellStart"/>
-            <w:proofErr w:type="gramStart"/>
             <w:r>
               <w:rPr>
                 <w:rFonts w:ascii="Segoe UI" w:hAnsi="Segoe UI" w:cs="Segoe UI"/>
@@ -446,8 +444,6 @@
               </w:rPr>
               <w:t>No</w:t>
             </w:r>
-            <w:proofErr w:type="spellEnd"/>
-            <w:proofErr w:type="gramEnd"/>
           </w:p>
         </w:tc>
         <w:tc>
@@ -1320,25 +1316,7 @@
                 <w:sz w:val="22"/>
                 <w:szCs w:val="22"/>
               </w:rPr>
-              <w:t>Warning shown on correct private [</w:t>
-            </w:r>
-            <w:proofErr w:type="spellStart"/>
-            <w:r>
-              <w:rPr>
-                <w:rFonts w:ascii="Segoe UI" w:hAnsi="Segoe UI" w:cs="Segoe UI"/>
-                <w:sz w:val="22"/>
-                <w:szCs w:val="22"/>
-              </w:rPr>
-              <w:t>JSInvokable</w:t>
-            </w:r>
-            <w:proofErr w:type="spellEnd"/>
-            <w:r>
-              <w:rPr>
-                <w:rFonts w:ascii="Segoe UI" w:hAnsi="Segoe UI" w:cs="Segoe UI"/>
-                <w:sz w:val="22"/>
-                <w:szCs w:val="22"/>
-              </w:rPr>
-              <w:t>] method</w:t>
+              <w:t>Warning shown on correct private [JSInvokable] method</w:t>
             </w:r>
           </w:p>
         </w:tc>
@@ -1824,25 +1802,7 @@
                 <w:sz w:val="22"/>
                 <w:szCs w:val="22"/>
               </w:rPr>
-              <w:t xml:space="preserve">Verify BL0016 </w:t>
-            </w:r>
-            <w:proofErr w:type="gramStart"/>
-            <w:r>
-              <w:rPr>
-                <w:rFonts w:ascii="Segoe UI" w:hAnsi="Segoe UI" w:cs="Segoe UI"/>
-                <w:sz w:val="22"/>
-                <w:szCs w:val="22"/>
-              </w:rPr>
-              <w:t>warning</w:t>
-            </w:r>
-            <w:proofErr w:type="gramEnd"/>
-            <w:r>
-              <w:rPr>
-                <w:rFonts w:ascii="Segoe UI" w:hAnsi="Segoe UI" w:cs="Segoe UI"/>
-                <w:sz w:val="22"/>
-                <w:szCs w:val="22"/>
-              </w:rPr>
-              <w:t xml:space="preserve"> in Visual Studio</w:t>
+              <w:t>Verify BL0016 warning in Visual Studio</w:t>
             </w:r>
           </w:p>
         </w:tc>
@@ -2026,23 +1986,13 @@
                 <w:szCs w:val="22"/>
               </w:rPr>
             </w:pPr>
-            <w:proofErr w:type="spellStart"/>
-            <w:r>
-              <w:rPr>
-                <w:rFonts w:ascii="Segoe UI" w:hAnsi="Segoe UI" w:cs="Segoe UI"/>
-                <w:sz w:val="22"/>
-                <w:szCs w:val="22"/>
-              </w:rPr>
-              <w:t>CorrectInterop</w:t>
-            </w:r>
-            <w:proofErr w:type="spellEnd"/>
-            <w:r>
-              <w:rPr>
-                <w:rFonts w:ascii="Segoe UI" w:hAnsi="Segoe UI" w:cs="Segoe UI"/>
-                <w:sz w:val="22"/>
-                <w:szCs w:val="22"/>
-              </w:rPr>
-              <w:t xml:space="preserve"> page builds with no BL00xx warnings</w:t>
+            <w:r>
+              <w:rPr>
+                <w:rFonts w:ascii="Segoe UI" w:hAnsi="Segoe UI" w:cs="Segoe UI"/>
+                <w:sz w:val="22"/>
+                <w:szCs w:val="22"/>
+              </w:rPr>
+              <w:t>CorrectInterop page builds with no BL00xx warnings</w:t>
             </w:r>
           </w:p>
         </w:tc>
@@ -2601,8 +2551,6 @@
                 <w:szCs w:val="22"/>
               </w:rPr>
             </w:pPr>
-            <w:proofErr w:type="spellStart"/>
-            <w:proofErr w:type="gramStart"/>
             <w:r>
               <w:rPr>
                 <w:rFonts w:ascii="Segoe UI" w:hAnsi="Segoe UI" w:cs="Segoe UI"/>
@@ -2627,8 +2575,6 @@
               </w:rPr>
               <w:t>No</w:t>
             </w:r>
-            <w:proofErr w:type="spellEnd"/>
-            <w:proofErr w:type="gramEnd"/>
           </w:p>
         </w:tc>
         <w:tc>
@@ -2818,25 +2764,7 @@
                 <w:sz w:val="22"/>
                 <w:szCs w:val="22"/>
               </w:rPr>
-              <w:t xml:space="preserve"> in Server </w:t>
-            </w:r>
-            <w:proofErr w:type="gramStart"/>
-            <w:r>
-              <w:rPr>
-                <w:rFonts w:ascii="Segoe UI" w:hAnsi="Segoe UI" w:cs="Segoe UI"/>
-                <w:sz w:val="22"/>
-                <w:szCs w:val="22"/>
-              </w:rPr>
-              <w:t>and .Client</w:t>
-            </w:r>
-            <w:proofErr w:type="gramEnd"/>
-            <w:r>
-              <w:rPr>
-                <w:rFonts w:ascii="Segoe UI" w:hAnsi="Segoe UI" w:cs="Segoe UI"/>
-                <w:sz w:val="22"/>
-                <w:szCs w:val="22"/>
-              </w:rPr>
-              <w:t xml:space="preserve"> projects</w:t>
+              <w:t xml:space="preserve"> in Server and .Client projects</w:t>
             </w:r>
           </w:p>
         </w:tc>
@@ -2988,25 +2916,7 @@
                 <w:sz w:val="22"/>
                 <w:szCs w:val="22"/>
               </w:rPr>
-              <w:t xml:space="preserve"> in Server</w:t>
-            </w:r>
-            <w:proofErr w:type="gramStart"/>
-            <w:r>
-              <w:rPr>
-                <w:rFonts w:ascii="Segoe UI" w:hAnsi="Segoe UI" w:cs="Segoe UI"/>
-                <w:sz w:val="22"/>
-                <w:szCs w:val="22"/>
-              </w:rPr>
-              <w:t>, .Client</w:t>
-            </w:r>
-            <w:proofErr w:type="gramEnd"/>
-            <w:r>
-              <w:rPr>
-                <w:rFonts w:ascii="Segoe UI" w:hAnsi="Segoe UI" w:cs="Segoe UI"/>
-                <w:sz w:val="22"/>
-                <w:szCs w:val="22"/>
-              </w:rPr>
-              <w:t xml:space="preserve"> and RCL projects</w:t>
+              <w:t xml:space="preserve"> in Server, .Client and RCL projects</w:t>
             </w:r>
           </w:p>
         </w:tc>
@@ -3176,25 +3086,7 @@
                 <w:sz w:val="22"/>
                 <w:szCs w:val="22"/>
               </w:rPr>
-              <w:t>Automatic code fix "Make [</w:t>
-            </w:r>
-            <w:proofErr w:type="spellStart"/>
-            <w:r>
-              <w:rPr>
-                <w:rFonts w:ascii="Segoe UI" w:hAnsi="Segoe UI" w:cs="Segoe UI"/>
-                <w:sz w:val="22"/>
-                <w:szCs w:val="22"/>
-              </w:rPr>
-              <w:t>JSInvokable</w:t>
-            </w:r>
-            <w:proofErr w:type="spellEnd"/>
-            <w:r>
-              <w:rPr>
-                <w:rFonts w:ascii="Segoe UI" w:hAnsi="Segoe UI" w:cs="Segoe UI"/>
-                <w:sz w:val="22"/>
-                <w:szCs w:val="22"/>
-              </w:rPr>
-              <w:t>] method public" is available ONLY in RCL project</w:t>
+              <w:t>Automatic code fix "Make [JSInvokable] method public" is available ONLY in RCL project</w:t>
             </w:r>
           </w:p>
         </w:tc>
@@ -3323,8 +3215,6 @@
                 <w:szCs w:val="22"/>
               </w:rPr>
             </w:pPr>
-            <w:proofErr w:type="spellStart"/>
-            <w:proofErr w:type="gramStart"/>
             <w:r>
               <w:rPr>
                 <w:rFonts w:ascii="Segoe UI" w:hAnsi="Segoe UI" w:cs="Segoe UI"/>
@@ -3349,8 +3239,6 @@
               </w:rPr>
               <w:t>No</w:t>
             </w:r>
-            <w:proofErr w:type="spellEnd"/>
-            <w:proofErr w:type="gramEnd"/>
           </w:p>
         </w:tc>
         <w:tc>
@@ -3578,51 +3466,15 @@
                 <w:sz w:val="22"/>
                 <w:szCs w:val="22"/>
               </w:rPr>
-              <w:t xml:space="preserve">Serialization error occurs when </w:t>
-            </w:r>
-            <w:proofErr w:type="spellStart"/>
-            <w:r>
-              <w:rPr>
-                <w:rFonts w:ascii="Segoe UI" w:hAnsi="Segoe UI" w:cs="Segoe UI"/>
-                <w:sz w:val="22"/>
-                <w:szCs w:val="22"/>
-              </w:rPr>
-              <w:t>InvokeAsync</w:t>
-            </w:r>
-            <w:proofErr w:type="spellEnd"/>
-            <w:r>
-              <w:rPr>
-                <w:rFonts w:ascii="Segoe UI" w:hAnsi="Segoe UI" w:cs="Segoe UI"/>
-                <w:sz w:val="22"/>
-                <w:szCs w:val="22"/>
-              </w:rPr>
-              <w:t>&lt;object&gt; used</w:t>
-            </w:r>
-            <w:r>
-              <w:rPr>
-                <w:rFonts w:ascii="Segoe UI" w:hAnsi="Segoe UI" w:cs="Segoe UI"/>
-                <w:sz w:val="22"/>
-                <w:szCs w:val="22"/>
-              </w:rPr>
-              <w:t xml:space="preserve"> and resolved when </w:t>
-            </w:r>
-            <w:proofErr w:type="spellStart"/>
-            <w:r>
-              <w:rPr>
-                <w:rFonts w:ascii="Segoe UI" w:hAnsi="Segoe UI" w:cs="Segoe UI"/>
-                <w:sz w:val="22"/>
-                <w:szCs w:val="22"/>
-              </w:rPr>
-              <w:t>InvokeVoidAsync</w:t>
-            </w:r>
-            <w:proofErr w:type="spellEnd"/>
-            <w:r>
-              <w:rPr>
-                <w:rFonts w:ascii="Segoe UI" w:hAnsi="Segoe UI" w:cs="Segoe UI"/>
-                <w:sz w:val="22"/>
-                <w:szCs w:val="22"/>
-              </w:rPr>
-              <w:t xml:space="preserve"> used.</w:t>
+              <w:t>Serialization error occurs when InvokeAsync&lt;object&gt; used</w:t>
+            </w:r>
+            <w:r>
+              <w:rPr>
+                <w:rFonts w:ascii="Segoe UI" w:hAnsi="Segoe UI" w:cs="Segoe UI"/>
+                <w:sz w:val="22"/>
+                <w:szCs w:val="22"/>
+              </w:rPr>
+              <w:t xml:space="preserve"> and resolved when InvokeVoidAsync used.</w:t>
             </w:r>
           </w:p>
         </w:tc>
@@ -3773,25 +3625,7 @@
                 <w:sz w:val="22"/>
                 <w:szCs w:val="22"/>
               </w:rPr>
-              <w:t>Method lookup fails when [</w:t>
-            </w:r>
-            <w:proofErr w:type="spellStart"/>
-            <w:r>
-              <w:rPr>
-                <w:rFonts w:ascii="Segoe UI" w:hAnsi="Segoe UI" w:cs="Segoe UI"/>
-                <w:sz w:val="22"/>
-                <w:szCs w:val="22"/>
-              </w:rPr>
-              <w:t>JSInvokable</w:t>
-            </w:r>
-            <w:proofErr w:type="spellEnd"/>
-            <w:r>
-              <w:rPr>
-                <w:rFonts w:ascii="Segoe UI" w:hAnsi="Segoe UI" w:cs="Segoe UI"/>
-                <w:sz w:val="22"/>
-                <w:szCs w:val="22"/>
-              </w:rPr>
-              <w:t>] is private</w:t>
+              <w:t>Method lookup fails when [JSInvokable] is private</w:t>
             </w:r>
             <w:r>
               <w:rPr>
@@ -3807,25 +3641,7 @@
                 <w:sz w:val="22"/>
                 <w:szCs w:val="22"/>
               </w:rPr>
-              <w:t>[</w:t>
-            </w:r>
-            <w:proofErr w:type="spellStart"/>
-            <w:r>
-              <w:rPr>
-                <w:rFonts w:ascii="Segoe UI" w:hAnsi="Segoe UI" w:cs="Segoe UI"/>
-                <w:sz w:val="22"/>
-                <w:szCs w:val="22"/>
-              </w:rPr>
-              <w:t>JSInvokable</w:t>
-            </w:r>
-            <w:proofErr w:type="spellEnd"/>
-            <w:r>
-              <w:rPr>
-                <w:rFonts w:ascii="Segoe UI" w:hAnsi="Segoe UI" w:cs="Segoe UI"/>
-                <w:sz w:val="22"/>
-                <w:szCs w:val="22"/>
-              </w:rPr>
-              <w:t xml:space="preserve">] is </w:t>
+              <w:t xml:space="preserve">[JSInvokable] is </w:t>
             </w:r>
             <w:r>
               <w:rPr>
@@ -4107,25 +3923,7 @@
                 <w:sz w:val="22"/>
                 <w:szCs w:val="22"/>
               </w:rPr>
-              <w:t xml:space="preserve">Guarded call in </w:t>
-            </w:r>
-            <w:proofErr w:type="spellStart"/>
-            <w:r>
-              <w:rPr>
-                <w:rFonts w:ascii="Segoe UI" w:hAnsi="Segoe UI" w:cs="Segoe UI"/>
-                <w:sz w:val="22"/>
-                <w:szCs w:val="22"/>
-              </w:rPr>
-              <w:t>OnAfterRender</w:t>
-            </w:r>
-            <w:proofErr w:type="spellEnd"/>
-            <w:r>
-              <w:rPr>
-                <w:rFonts w:ascii="Segoe UI" w:hAnsi="Segoe UI" w:cs="Segoe UI"/>
-                <w:sz w:val="22"/>
-                <w:szCs w:val="22"/>
-              </w:rPr>
-              <w:t xml:space="preserve"> succeeds</w:t>
+              <w:t>Guarded call in OnAfterRender succeeds</w:t>
             </w:r>
           </w:p>
         </w:tc>
@@ -4256,8 +4054,6 @@
                 <w:szCs w:val="22"/>
               </w:rPr>
             </w:pPr>
-            <w:proofErr w:type="spellStart"/>
-            <w:proofErr w:type="gramStart"/>
             <w:r>
               <w:rPr>
                 <w:rFonts w:ascii="Segoe UI" w:hAnsi="Segoe UI" w:cs="Segoe UI"/>
@@ -4266,8 +4062,6 @@
               </w:rPr>
               <w:t>S.No</w:t>
             </w:r>
-            <w:proofErr w:type="spellEnd"/>
-            <w:proofErr w:type="gramEnd"/>
           </w:p>
         </w:tc>
         <w:tc>
@@ -4421,25 +4215,7 @@
                 <w:sz w:val="22"/>
                 <w:szCs w:val="22"/>
               </w:rPr>
-              <w:t xml:space="preserve">Build BL0010 warning </w:t>
-            </w:r>
-            <w:proofErr w:type="gramStart"/>
-            <w:r>
-              <w:rPr>
-                <w:rFonts w:ascii="Segoe UI" w:hAnsi="Segoe UI" w:cs="Segoe UI"/>
-                <w:sz w:val="22"/>
-                <w:szCs w:val="22"/>
-              </w:rPr>
-              <w:t>in .Client</w:t>
-            </w:r>
-            <w:proofErr w:type="gramEnd"/>
-            <w:r>
-              <w:rPr>
-                <w:rFonts w:ascii="Segoe UI" w:hAnsi="Segoe UI" w:cs="Segoe UI"/>
-                <w:sz w:val="22"/>
-                <w:szCs w:val="22"/>
-              </w:rPr>
-              <w:t xml:space="preserve"> project</w:t>
+              <w:t>Build BL0010 warning in .Client project</w:t>
             </w:r>
           </w:p>
         </w:tc>
@@ -4566,25 +4342,7 @@
                 <w:sz w:val="22"/>
                 <w:szCs w:val="22"/>
               </w:rPr>
-              <w:t xml:space="preserve">Build BL0015 warning </w:t>
-            </w:r>
-            <w:proofErr w:type="gramStart"/>
-            <w:r>
-              <w:rPr>
-                <w:rFonts w:ascii="Segoe UI" w:hAnsi="Segoe UI" w:cs="Segoe UI"/>
-                <w:sz w:val="22"/>
-                <w:szCs w:val="22"/>
-              </w:rPr>
-              <w:t>in .Client</w:t>
-            </w:r>
-            <w:proofErr w:type="gramEnd"/>
-            <w:r>
-              <w:rPr>
-                <w:rFonts w:ascii="Segoe UI" w:hAnsi="Segoe UI" w:cs="Segoe UI"/>
-                <w:sz w:val="22"/>
-                <w:szCs w:val="22"/>
-              </w:rPr>
-              <w:t xml:space="preserve"> project</w:t>
+              <w:t>Build BL0015 warning in .Client project</w:t>
             </w:r>
           </w:p>
         </w:tc>
@@ -4714,25 +4472,7 @@
                 <w:sz w:val="22"/>
                 <w:szCs w:val="22"/>
               </w:rPr>
-              <w:t xml:space="preserve">Build BL0016 warning </w:t>
-            </w:r>
-            <w:proofErr w:type="gramStart"/>
-            <w:r>
-              <w:rPr>
-                <w:rFonts w:ascii="Segoe UI" w:hAnsi="Segoe UI" w:cs="Segoe UI"/>
-                <w:sz w:val="22"/>
-                <w:szCs w:val="22"/>
-              </w:rPr>
-              <w:t>in .Client</w:t>
-            </w:r>
-            <w:proofErr w:type="gramEnd"/>
-            <w:r>
-              <w:rPr>
-                <w:rFonts w:ascii="Segoe UI" w:hAnsi="Segoe UI" w:cs="Segoe UI"/>
-                <w:sz w:val="22"/>
-                <w:szCs w:val="22"/>
-              </w:rPr>
-              <w:t xml:space="preserve"> project</w:t>
+              <w:t>Build BL0016 warning in .Client project</w:t>
             </w:r>
           </w:p>
         </w:tc>
@@ -4896,8 +4636,6 @@
                 <w:szCs w:val="22"/>
               </w:rPr>
             </w:pPr>
-            <w:proofErr w:type="spellStart"/>
-            <w:proofErr w:type="gramStart"/>
             <w:r>
               <w:rPr>
                 <w:rFonts w:ascii="Segoe UI" w:hAnsi="Segoe UI" w:cs="Segoe UI"/>
@@ -4906,8 +4644,6 @@
               </w:rPr>
               <w:t>S.No</w:t>
             </w:r>
-            <w:proofErr w:type="spellEnd"/>
-            <w:proofErr w:type="gramEnd"/>
           </w:p>
         </w:tc>
         <w:tc>
@@ -5525,8 +5261,6 @@
         </w:rPr>
         <w:t xml:space="preserve">For BL0010, Visual Studio highlights the warning directly on the </w:t>
       </w:r>
-      <w:proofErr w:type="spellStart"/>
-      <w:proofErr w:type="gramStart"/>
       <w:r>
         <w:rPr>
           <w:rFonts w:ascii="Segoe UI" w:hAnsi="Segoe UI" w:cs="Segoe UI"/>
@@ -5535,41 +5269,7 @@
           <w:sz w:val="22"/>
           <w:szCs w:val="22"/>
         </w:rPr>
-        <w:t>JS.InvokeAsync</w:t>
-      </w:r>
-      <w:proofErr w:type="spellEnd"/>
-      <w:proofErr w:type="gramEnd"/>
-      <w:r>
-        <w:rPr>
-          <w:rFonts w:ascii="Segoe UI" w:hAnsi="Segoe UI" w:cs="Segoe UI"/>
-          <w:b/>
-          <w:bCs/>
-          <w:sz w:val="22"/>
-          <w:szCs w:val="22"/>
-        </w:rPr>
-        <w:t>&lt;object</w:t>
-      </w:r>
-      <w:proofErr w:type="gramStart"/>
-      <w:r>
-        <w:rPr>
-          <w:rFonts w:ascii="Segoe UI" w:hAnsi="Segoe UI" w:cs="Segoe UI"/>
-          <w:b/>
-          <w:bCs/>
-          <w:sz w:val="22"/>
-          <w:szCs w:val="22"/>
-        </w:rPr>
-        <w:t>&gt;(</w:t>
-      </w:r>
-      <w:proofErr w:type="gramEnd"/>
-      <w:r>
-        <w:rPr>
-          <w:rFonts w:ascii="Segoe UI" w:hAnsi="Segoe UI" w:cs="Segoe UI"/>
-          <w:b/>
-          <w:bCs/>
-          <w:sz w:val="22"/>
-          <w:szCs w:val="22"/>
-        </w:rPr>
-        <w:t>)</w:t>
+        <w:t>JS.InvokeAsync&lt;object&gt;()</w:t>
       </w:r>
       <w:r>
         <w:rPr>
@@ -5769,43 +5469,7 @@
           <w:sz w:val="22"/>
           <w:szCs w:val="22"/>
         </w:rPr>
-        <w:t xml:space="preserve"> automatic code fix ("Make [</w:t>
-      </w:r>
-      <w:proofErr w:type="spellStart"/>
-      <w:r>
-        <w:rPr>
-          <w:rFonts w:ascii="Segoe UI" w:hAnsi="Segoe UI" w:cs="Segoe UI"/>
-          <w:sz w:val="22"/>
-          <w:szCs w:val="22"/>
-        </w:rPr>
-        <w:t>JSInvokable</w:t>
-      </w:r>
-      <w:proofErr w:type="spellEnd"/>
-      <w:r>
-        <w:rPr>
-          <w:rFonts w:ascii="Segoe UI" w:hAnsi="Segoe UI" w:cs="Segoe UI"/>
-          <w:sz w:val="22"/>
-          <w:szCs w:val="22"/>
-        </w:rPr>
-        <w:t xml:space="preserve">] method public") is available exclusively in the Razor Class Library project. When the same diagnostic appears in server project components </w:t>
-      </w:r>
-      <w:proofErr w:type="gramStart"/>
-      <w:r>
-        <w:rPr>
-          <w:rFonts w:ascii="Segoe UI" w:hAnsi="Segoe UI" w:cs="Segoe UI"/>
-          <w:sz w:val="22"/>
-          <w:szCs w:val="22"/>
-        </w:rPr>
-        <w:t>and .Client</w:t>
-      </w:r>
-      <w:proofErr w:type="gramEnd"/>
-      <w:r>
-        <w:rPr>
-          <w:rFonts w:ascii="Segoe UI" w:hAnsi="Segoe UI" w:cs="Segoe UI"/>
-          <w:sz w:val="22"/>
-          <w:szCs w:val="22"/>
-        </w:rPr>
-        <w:t xml:space="preserve"> project components, the automatic code fix is not available and must be applied manually. This behavior difference between project types suggests the code fix implementation is context-dependent, available only for class library services but not for Razor component files.</w:t>
+        <w:t xml:space="preserve"> automatic code fix ("Make [JSInvokable] method public") is available exclusively in the Razor Class Library project. When the same diagnostic appears in server project components and .Client project components, the automatic code fix is not available and must be applied manually. This behavior difference between project types suggests the code fix implementation is context-dependent, available only for class library services but not for Razor component files.</w:t>
       </w:r>
     </w:p>
     <w:p>
@@ -6020,7 +5684,6 @@
           <w:u w:val="single"/>
         </w:rPr>
       </w:pPr>
-      <w:proofErr w:type="gramStart"/>
       <w:r>
         <w:rPr>
           <w:rFonts w:ascii="Segoe UI" w:hAnsi="Segoe UI" w:cs="Segoe UI"/>
@@ -6033,7 +5696,6 @@
         <w:lastRenderedPageBreak/>
         <w:t>Final Result</w:t>
       </w:r>
-      <w:proofErr w:type="gramEnd"/>
     </w:p>
     <w:p>
       <w:pPr>
@@ -6100,25 +5762,7 @@
           <w:sz w:val="22"/>
           <w:szCs w:val="22"/>
         </w:rPr>
-        <w:t xml:space="preserve">with clear diagnostic messages and explanations. Runtime behavior matches diagnostic intent. The application demonstrates correct interop patterns producing zero warnings. Static SSR and Interactive Server render modes both </w:t>
-      </w:r>
-      <w:proofErr w:type="gramStart"/>
-      <w:r>
-        <w:rPr>
-          <w:rFonts w:ascii="Segoe UI" w:hAnsi="Segoe UI" w:cs="Segoe UI"/>
-          <w:sz w:val="22"/>
-          <w:szCs w:val="22"/>
-        </w:rPr>
-        <w:t>function</w:t>
-      </w:r>
-      <w:proofErr w:type="gramEnd"/>
-      <w:r>
-        <w:rPr>
-          <w:rFonts w:ascii="Segoe UI" w:hAnsi="Segoe UI" w:cs="Segoe UI"/>
-          <w:sz w:val="22"/>
-          <w:szCs w:val="22"/>
-        </w:rPr>
-        <w:t xml:space="preserve"> correctly. </w:t>
+        <w:t xml:space="preserve">with clear diagnostic messages and explanations. Runtime behavior matches diagnostic intent. The application demonstrates correct interop patterns producing zero warnings. Static SSR and Interactive Server render modes both function correctly. </w:t>
       </w:r>
     </w:p>
     <w:p>

</xml_diff>